<commit_message>
Agrega registro digital de variables energeticas
</commit_message>
<xml_diff>
--- a/PAF/Mori_Cumpen-Piñin_Fernandez-Rodriguez_Samaniego-Temoche_Cumpa_PAF.docx
+++ b/PAF/Mori_Cumpen-Piñin_Fernandez-Rodriguez_Samaniego-Temoche_Cumpa_PAF.docx
@@ -4398,7 +4398,23 @@
           <w:rFonts w:ascii="Times New Roman" w:eastAsia="Times New Roman" w:hAnsi="Times New Roman" w:cs="Times New Roman"/>
           <w:lang w:val="es-ES"/>
         </w:rPr>
-        <w:t xml:space="preserve"> y Machine Learning en las plantas agroindustriales continúa siendo limitada debido a factores como el desconocimiento tecnológico, los costos de implementación y la ausencia de soluciones adaptadas al contexto regional. En muchos casos, el monitoreo energético depende únicamente de inspecciones técnicas periódicas o de sistemas convencionales que no permiten realizar predicciones sobre el comportamiento futuro del consumo eléctrico ni detectar anomalías energéticas de manera automatizada </w:t>
+        <w:t xml:space="preserve"> y Machine </w:t>
+      </w:r>
+      <w:proofErr w:type="spellStart"/>
+      <w:r>
+        <w:rPr>
+          <w:rFonts w:ascii="Times New Roman" w:eastAsia="Times New Roman" w:hAnsi="Times New Roman" w:cs="Times New Roman"/>
+          <w:lang w:val="es-ES"/>
+        </w:rPr>
+        <w:t>Learning</w:t>
+      </w:r>
+      <w:proofErr w:type="spellEnd"/>
+      <w:r>
+        <w:rPr>
+          <w:rFonts w:ascii="Times New Roman" w:eastAsia="Times New Roman" w:hAnsi="Times New Roman" w:cs="Times New Roman"/>
+          <w:lang w:val="es-ES"/>
+        </w:rPr>
+        <w:t xml:space="preserve"> en las plantas agroindustriales continúa siendo limitada debido a factores como el desconocimiento tecnológico, los costos de implementación y la ausencia de soluciones adaptadas al contexto regional. En muchos casos, el monitoreo energético depende únicamente de inspecciones técnicas periódicas o de sistemas convencionales que no permiten realizar predicciones sobre el comportamiento futuro del consumo eléctrico ni detectar anomalías energéticas de manera automatizada </w:t>
       </w:r>
       <w:r>
         <w:rPr>
@@ -4636,7 +4652,23 @@
           <w:rFonts w:ascii="Times New Roman" w:eastAsia="Times New Roman" w:hAnsi="Times New Roman" w:cs="Times New Roman"/>
           <w:lang w:val="es-ES"/>
         </w:rPr>
-        <w:t xml:space="preserve"> y Machine Learning aplicadas al sector agroindustrial </w:t>
+        <w:t xml:space="preserve"> y Machine </w:t>
+      </w:r>
+      <w:proofErr w:type="spellStart"/>
+      <w:r>
+        <w:rPr>
+          <w:rFonts w:ascii="Times New Roman" w:eastAsia="Times New Roman" w:hAnsi="Times New Roman" w:cs="Times New Roman"/>
+          <w:lang w:val="es-ES"/>
+        </w:rPr>
+        <w:t>Learning</w:t>
+      </w:r>
+      <w:proofErr w:type="spellEnd"/>
+      <w:r>
+        <w:rPr>
+          <w:rFonts w:ascii="Times New Roman" w:eastAsia="Times New Roman" w:hAnsi="Times New Roman" w:cs="Times New Roman"/>
+          <w:lang w:val="es-ES"/>
+        </w:rPr>
+        <w:t xml:space="preserve"> aplicadas al sector agroindustrial </w:t>
       </w:r>
       <w:r>
         <w:rPr>
@@ -4681,7 +4713,23 @@
           <w:rFonts w:ascii="Times New Roman" w:eastAsia="Times New Roman" w:hAnsi="Times New Roman" w:cs="Times New Roman"/>
           <w:lang w:val="es-ES"/>
         </w:rPr>
-        <w:t xml:space="preserve">No obstante, pese a los avances tecnológicos existentes, persiste una importante brecha científica y tecnológica relacionada con la limitada implementación de soluciones inteligentes adaptadas al contexto agroindustrial peruano y regional. La mayoría de las investigaciones actuales han sido desarrolladas en contextos internacionales o requieren infraestructuras tecnológicas complejas y costosas, dificultando su adopción en empresas agroindustriales de Lambayeque. Del mismo modo, existe escasa evidencia científica orientada específicamente al desarrollo de sistemas inteligentes basados en Machine Learning e </w:t>
+        <w:t xml:space="preserve">No obstante, pese a los avances tecnológicos existentes, persiste una importante brecha científica y tecnológica relacionada con la limitada implementación de soluciones inteligentes adaptadas al contexto agroindustrial peruano y regional. La mayoría de las investigaciones actuales han sido desarrolladas en contextos internacionales o requieren infraestructuras tecnológicas complejas y costosas, dificultando su adopción en empresas agroindustriales de Lambayeque. Del mismo modo, existe escasa evidencia científica orientada específicamente al desarrollo de sistemas inteligentes basados en Machine </w:t>
+      </w:r>
+      <w:proofErr w:type="spellStart"/>
+      <w:r>
+        <w:rPr>
+          <w:rFonts w:ascii="Times New Roman" w:eastAsia="Times New Roman" w:hAnsi="Times New Roman" w:cs="Times New Roman"/>
+          <w:lang w:val="es-ES"/>
+        </w:rPr>
+        <w:t>Learning</w:t>
+      </w:r>
+      <w:proofErr w:type="spellEnd"/>
+      <w:r>
+        <w:rPr>
+          <w:rFonts w:ascii="Times New Roman" w:eastAsia="Times New Roman" w:hAnsi="Times New Roman" w:cs="Times New Roman"/>
+          <w:lang w:val="es-ES"/>
+        </w:rPr>
+        <w:t xml:space="preserve"> e </w:t>
       </w:r>
       <w:proofErr w:type="spellStart"/>
       <w:r>
@@ -4742,7 +4790,23 @@
           <w:rFonts w:ascii="Times New Roman" w:eastAsia="Times New Roman" w:hAnsi="Times New Roman" w:cs="Times New Roman"/>
           <w:lang w:val="es-ES"/>
         </w:rPr>
-        <w:t xml:space="preserve">En ese sentido, se evidencia la necesidad de desarrollar un sistema inteligente basado en Machine Learning e </w:t>
+        <w:t xml:space="preserve">En ese sentido, se evidencia la necesidad de desarrollar un sistema inteligente basado en Machine </w:t>
+      </w:r>
+      <w:proofErr w:type="spellStart"/>
+      <w:r>
+        <w:rPr>
+          <w:rFonts w:ascii="Times New Roman" w:eastAsia="Times New Roman" w:hAnsi="Times New Roman" w:cs="Times New Roman"/>
+          <w:lang w:val="es-ES"/>
+        </w:rPr>
+        <w:t>Learning</w:t>
+      </w:r>
+      <w:proofErr w:type="spellEnd"/>
+      <w:r>
+        <w:rPr>
+          <w:rFonts w:ascii="Times New Roman" w:eastAsia="Times New Roman" w:hAnsi="Times New Roman" w:cs="Times New Roman"/>
+          <w:lang w:val="es-ES"/>
+        </w:rPr>
+        <w:t xml:space="preserve"> e </w:t>
       </w:r>
       <w:proofErr w:type="spellStart"/>
       <w:r>
@@ -4879,7 +4943,23 @@
           <w:rFonts w:ascii="Times New Roman" w:eastAsia="Times New Roman" w:hAnsi="Times New Roman" w:cs="Times New Roman"/>
           <w:lang w:val="es-ES"/>
         </w:rPr>
-        <w:t xml:space="preserve"> y Machine Learning permite optimizar el consumo energético industrial, mejorar la eficiencia operativa y contribuir al cumplimiento de objetivos de sostenibilidad energética </w:t>
+        <w:t xml:space="preserve"> y Machine </w:t>
+      </w:r>
+      <w:proofErr w:type="spellStart"/>
+      <w:r>
+        <w:rPr>
+          <w:rFonts w:ascii="Times New Roman" w:eastAsia="Times New Roman" w:hAnsi="Times New Roman" w:cs="Times New Roman"/>
+          <w:lang w:val="es-ES"/>
+        </w:rPr>
+        <w:t>Learning</w:t>
+      </w:r>
+      <w:proofErr w:type="spellEnd"/>
+      <w:r>
+        <w:rPr>
+          <w:rFonts w:ascii="Times New Roman" w:eastAsia="Times New Roman" w:hAnsi="Times New Roman" w:cs="Times New Roman"/>
+          <w:lang w:val="es-ES"/>
+        </w:rPr>
+        <w:t xml:space="preserve"> permite optimizar el consumo energético industrial, mejorar la eficiencia operativa y contribuir al cumplimiento de objetivos de sostenibilidad energética </w:t>
       </w:r>
       <w:r>
         <w:rPr>
@@ -5529,7 +5609,7 @@
           <w:rFonts w:ascii="Times New Roman" w:eastAsia="Times New Roman" w:hAnsi="Times New Roman" w:cs="Times New Roman"/>
           <w:lang w:val="es-ES"/>
         </w:rPr>
-        <w:t xml:space="preserve">) y Machine Learning (ML) en la manufactura inteligente, debido a la necesidad de optimizar los procesos industriales, mejorar la seguridad y reducir costos operativos. Para ello, los autores realizaron una revisión sistemática mediante la metodología PRISMA, analizando 135 documentos científicos provenientes principalmente de Elsevier, MDPI, IEEE y Springer. Durante el análisis se identificó el uso recurrente de algoritmos de aprendizaje automático como </w:t>
+        <w:t xml:space="preserve">) y Machine </w:t>
       </w:r>
       <w:proofErr w:type="spellStart"/>
       <w:r>
@@ -5537,6 +5617,22 @@
           <w:rFonts w:ascii="Times New Roman" w:eastAsia="Times New Roman" w:hAnsi="Times New Roman" w:cs="Times New Roman"/>
           <w:lang w:val="es-ES"/>
         </w:rPr>
+        <w:t>Learning</w:t>
+      </w:r>
+      <w:proofErr w:type="spellEnd"/>
+      <w:r>
+        <w:rPr>
+          <w:rFonts w:ascii="Times New Roman" w:eastAsia="Times New Roman" w:hAnsi="Times New Roman" w:cs="Times New Roman"/>
+          <w:lang w:val="es-ES"/>
+        </w:rPr>
+        <w:t xml:space="preserve"> (ML) en la manufactura inteligente, debido a la necesidad de optimizar los procesos industriales, mejorar la seguridad y reducir costos operativos. Para ello, los autores realizaron una revisión sistemática mediante la metodología PRISMA, analizando 135 documentos científicos provenientes principalmente de Elsevier, MDPI, IEEE y Springer. Durante el análisis se identificó el uso recurrente de algoritmos de aprendizaje automático como </w:t>
+      </w:r>
+      <w:proofErr w:type="spellStart"/>
+      <w:r>
+        <w:rPr>
+          <w:rFonts w:ascii="Times New Roman" w:eastAsia="Times New Roman" w:hAnsi="Times New Roman" w:cs="Times New Roman"/>
+          <w:lang w:val="es-ES"/>
+        </w:rPr>
         <w:t>Decision</w:t>
       </w:r>
       <w:proofErr w:type="spellEnd"/>
@@ -5641,7 +5737,23 @@
           <w:rFonts w:ascii="Times New Roman" w:eastAsia="Times New Roman" w:hAnsi="Times New Roman" w:cs="Times New Roman"/>
           <w:lang w:val="es-ES"/>
         </w:rPr>
-        <w:t xml:space="preserve"> y Machine Learning constituye un pilar fundamental para la Industria 4.0, al incrementar la eficiencia operativa, reducir costos y fortalecer la sostenibilidad de los entornos de manufactura inteligente </w:t>
+        <w:t xml:space="preserve"> y Machine </w:t>
+      </w:r>
+      <w:proofErr w:type="spellStart"/>
+      <w:r>
+        <w:rPr>
+          <w:rFonts w:ascii="Times New Roman" w:eastAsia="Times New Roman" w:hAnsi="Times New Roman" w:cs="Times New Roman"/>
+          <w:lang w:val="es-ES"/>
+        </w:rPr>
+        <w:t>Learning</w:t>
+      </w:r>
+      <w:proofErr w:type="spellEnd"/>
+      <w:r>
+        <w:rPr>
+          <w:rFonts w:ascii="Times New Roman" w:eastAsia="Times New Roman" w:hAnsi="Times New Roman" w:cs="Times New Roman"/>
+          <w:lang w:val="es-ES"/>
+        </w:rPr>
+        <w:t xml:space="preserve"> constituye un pilar fundamental para la Industria 4.0, al incrementar la eficiencia operativa, reducir costos y fortalecer la sostenibilidad de los entornos de manufactura inteligente </w:t>
       </w:r>
       <w:r>
         <w:rPr>
@@ -5844,7 +5956,7 @@
           <w:rFonts w:ascii="Times New Roman" w:eastAsia="Times New Roman" w:hAnsi="Times New Roman" w:cs="Times New Roman"/>
           <w:lang w:val="es-ES"/>
         </w:rPr>
-        <w:t xml:space="preserve"> Learning (DRL). Para ello, analizaron aplicaciones relacionadas con manufactura inteligente, mantenimiento predictivo, monitoreo energético, salud industrial y automatización avanzada. Los resultados evidenciaron que los modelos Deep Learning permiten optimizar procesos industriales, reducir costos operativos y mejorar la productividad. Asimismo, estudios analizados dentro de la revisión reportaron mejoras de hasta 94 % en tareas de inspección y control de calidad mediante CNN, mientras que el mercado global de </w:t>
+        <w:t xml:space="preserve"> </w:t>
       </w:r>
       <w:proofErr w:type="spellStart"/>
       <w:r>
@@ -5852,6 +5964,22 @@
           <w:rFonts w:ascii="Times New Roman" w:eastAsia="Times New Roman" w:hAnsi="Times New Roman" w:cs="Times New Roman"/>
           <w:lang w:val="es-ES"/>
         </w:rPr>
+        <w:t>Learning</w:t>
+      </w:r>
+      <w:proofErr w:type="spellEnd"/>
+      <w:r>
+        <w:rPr>
+          <w:rFonts w:ascii="Times New Roman" w:eastAsia="Times New Roman" w:hAnsi="Times New Roman" w:cs="Times New Roman"/>
+          <w:lang w:val="es-ES"/>
+        </w:rPr>
+        <w:t xml:space="preserve"> (DRL). Para ello, analizaron aplicaciones relacionadas con manufactura inteligente, mantenimiento predictivo, monitoreo energético, salud industrial y automatización avanzada. Los resultados evidenciaron que los modelos Deep Learning permiten optimizar procesos industriales, reducir costos operativos y mejorar la productividad. Asimismo, estudios analizados dentro de la revisión reportaron mejoras de hasta 94 % en tareas de inspección y control de calidad mediante CNN, mientras que el mercado global de </w:t>
+      </w:r>
+      <w:proofErr w:type="spellStart"/>
+      <w:r>
+        <w:rPr>
+          <w:rFonts w:ascii="Times New Roman" w:eastAsia="Times New Roman" w:hAnsi="Times New Roman" w:cs="Times New Roman"/>
+          <w:lang w:val="es-ES"/>
+        </w:rPr>
         <w:t>IIoT</w:t>
       </w:r>
       <w:proofErr w:type="spellEnd"/>
@@ -5860,7 +5988,23 @@
           <w:rFonts w:ascii="Times New Roman" w:eastAsia="Times New Roman" w:hAnsi="Times New Roman" w:cs="Times New Roman"/>
           <w:lang w:val="es-ES"/>
         </w:rPr>
-        <w:t xml:space="preserve"> mostró un crecimiento de aproximadamente 12.6 %, pasando de 110 mil millones de dólares en 2017 a 123.89 mil millones de dólares en 2021. Finalmente, los autores concluyeron que la integración de Deep Learning e </w:t>
+        <w:t xml:space="preserve"> mostró un crecimiento de aproximadamente 12.6 %, pasando de 110 mil millones de dólares en 2017 a 123.89 mil millones de dólares en 2021. Finalmente, los autores concluyeron que la integración de Deep </w:t>
+      </w:r>
+      <w:proofErr w:type="spellStart"/>
+      <w:r>
+        <w:rPr>
+          <w:rFonts w:ascii="Times New Roman" w:eastAsia="Times New Roman" w:hAnsi="Times New Roman" w:cs="Times New Roman"/>
+          <w:lang w:val="es-ES"/>
+        </w:rPr>
+        <w:t>Learning</w:t>
+      </w:r>
+      <w:proofErr w:type="spellEnd"/>
+      <w:r>
+        <w:rPr>
+          <w:rFonts w:ascii="Times New Roman" w:eastAsia="Times New Roman" w:hAnsi="Times New Roman" w:cs="Times New Roman"/>
+          <w:lang w:val="es-ES"/>
+        </w:rPr>
+        <w:t xml:space="preserve"> e </w:t>
       </w:r>
       <w:proofErr w:type="spellStart"/>
       <w:r>
@@ -6039,7 +6183,7 @@
           <w:lang w:val="es-ES"/>
         </w:rPr>
         <w:lastRenderedPageBreak/>
-        <w:t xml:space="preserve">principal las limitaciones de los métodos tradicionales para adaptarse a las variaciones en tiempo real de la demanda energética, lo que genera distribución ineficiente de recursos, elevados costos operativos y desperdicio de energía. Como solución, propusieron una arquitectura basada en Deep Learning, sensores </w:t>
+        <w:t xml:space="preserve">principal las limitaciones de los métodos tradicionales para adaptarse a las variaciones en tiempo real de la demanda energética, lo que genera distribución ineficiente de recursos, elevados costos operativos y desperdicio de energía. Como solución, propusieron una arquitectura basada en Deep </w:t>
       </w:r>
       <w:proofErr w:type="spellStart"/>
       <w:r>
@@ -6047,6 +6191,22 @@
           <w:rFonts w:ascii="Times New Roman" w:eastAsia="Times New Roman" w:hAnsi="Times New Roman" w:cs="Times New Roman"/>
           <w:lang w:val="es-ES"/>
         </w:rPr>
+        <w:t>Learning</w:t>
+      </w:r>
+      <w:proofErr w:type="spellEnd"/>
+      <w:r>
+        <w:rPr>
+          <w:rFonts w:ascii="Times New Roman" w:eastAsia="Times New Roman" w:hAnsi="Times New Roman" w:cs="Times New Roman"/>
+          <w:lang w:val="es-ES"/>
+        </w:rPr>
+        <w:t xml:space="preserve">, sensores </w:t>
+      </w:r>
+      <w:proofErr w:type="spellStart"/>
+      <w:r>
+        <w:rPr>
+          <w:rFonts w:ascii="Times New Roman" w:eastAsia="Times New Roman" w:hAnsi="Times New Roman" w:cs="Times New Roman"/>
+          <w:lang w:val="es-ES"/>
+        </w:rPr>
         <w:t>IoT</w:t>
       </w:r>
       <w:proofErr w:type="spellEnd"/>
@@ -6071,7 +6231,23 @@
           <w:rFonts w:ascii="Times New Roman" w:eastAsia="Times New Roman" w:hAnsi="Times New Roman" w:cs="Times New Roman"/>
           <w:lang w:val="es-ES"/>
         </w:rPr>
-        <w:t xml:space="preserve"> integrados en infraestructuras de redes inteligentes. Los resultados demostraron una precisión del 93.38 % en la predicción de la demanda energética, una estabilidad de red del 96.25 %, una mejora del 15.22 % en la eficiencia de distribución de recursos, una reducción del desperdicio energético hasta 12.96 % y una disminución de los costos operativos del 22.96 %. Finalmente, los autores concluyeron que la integración de Deep Learning e </w:t>
+        <w:t xml:space="preserve"> integrados en infraestructuras de redes inteligentes. Los resultados demostraron una precisión del 93.38 % en la predicción de la demanda energética, una estabilidad de red del 96.25 %, una mejora del 15.22 % en la eficiencia de distribución de recursos, una reducción del desperdicio energético hasta 12.96 % y una disminución de los costos operativos del 22.96 %. Finalmente, los autores concluyeron que la integración de Deep </w:t>
+      </w:r>
+      <w:proofErr w:type="spellStart"/>
+      <w:r>
+        <w:rPr>
+          <w:rFonts w:ascii="Times New Roman" w:eastAsia="Times New Roman" w:hAnsi="Times New Roman" w:cs="Times New Roman"/>
+          <w:lang w:val="es-ES"/>
+        </w:rPr>
+        <w:t>Learning</w:t>
+      </w:r>
+      <w:proofErr w:type="spellEnd"/>
+      <w:r>
+        <w:rPr>
+          <w:rFonts w:ascii="Times New Roman" w:eastAsia="Times New Roman" w:hAnsi="Times New Roman" w:cs="Times New Roman"/>
+          <w:lang w:val="es-ES"/>
+        </w:rPr>
+        <w:t xml:space="preserve"> e </w:t>
       </w:r>
       <w:proofErr w:type="spellStart"/>
       <w:r>
@@ -6489,7 +6665,39 @@
           <w:lang w:val="es-ES"/>
         </w:rPr>
         <w:lastRenderedPageBreak/>
-        <w:t xml:space="preserve">Los trabajos previos revisados aportan sustento directo a la presente investigación, debido a que evidencian que la integración de Machine Learning, Deep Learning, </w:t>
+        <w:t xml:space="preserve">Los trabajos previos revisados aportan sustento directo a la presente investigación, debido a que evidencian que la integración de Machine </w:t>
+      </w:r>
+      <w:proofErr w:type="spellStart"/>
+      <w:r>
+        <w:rPr>
+          <w:rFonts w:ascii="Times New Roman" w:eastAsia="Times New Roman" w:hAnsi="Times New Roman" w:cs="Times New Roman"/>
+          <w:lang w:val="es-ES"/>
+        </w:rPr>
+        <w:t>Learning</w:t>
+      </w:r>
+      <w:proofErr w:type="spellEnd"/>
+      <w:r>
+        <w:rPr>
+          <w:rFonts w:ascii="Times New Roman" w:eastAsia="Times New Roman" w:hAnsi="Times New Roman" w:cs="Times New Roman"/>
+          <w:lang w:val="es-ES"/>
+        </w:rPr>
+        <w:t xml:space="preserve">, Deep </w:t>
+      </w:r>
+      <w:proofErr w:type="spellStart"/>
+      <w:r>
+        <w:rPr>
+          <w:rFonts w:ascii="Times New Roman" w:eastAsia="Times New Roman" w:hAnsi="Times New Roman" w:cs="Times New Roman"/>
+          <w:lang w:val="es-ES"/>
+        </w:rPr>
+        <w:t>Learning</w:t>
+      </w:r>
+      <w:proofErr w:type="spellEnd"/>
+      <w:r>
+        <w:rPr>
+          <w:rFonts w:ascii="Times New Roman" w:eastAsia="Times New Roman" w:hAnsi="Times New Roman" w:cs="Times New Roman"/>
+          <w:lang w:val="es-ES"/>
+        </w:rPr>
+        <w:t xml:space="preserve">, </w:t>
       </w:r>
       <w:proofErr w:type="spellStart"/>
       <w:r>
@@ -6916,7 +7124,23 @@
           <w:rFonts w:ascii="Times New Roman" w:hAnsi="Times New Roman" w:cs="Times New Roman"/>
           <w:lang w:val="es-ES"/>
         </w:rPr>
-        <w:t xml:space="preserve"> y Machine Learning permite desarrollar sistemas inteligentes capaces de optimizar el consumo energético mediante análisis predictivos y aprendizaje continuo. Estos modelos mejoran la precisión en la toma de decisiones relacionadas con la gestión energética industrial y contribuyen a reducir costos operativos mediante la detección temprana de ineficiencias energéticas.</w:t>
+        <w:t xml:space="preserve"> y Machine </w:t>
+      </w:r>
+      <w:proofErr w:type="spellStart"/>
+      <w:r>
+        <w:rPr>
+          <w:rFonts w:ascii="Times New Roman" w:hAnsi="Times New Roman" w:cs="Times New Roman"/>
+          <w:lang w:val="es-ES"/>
+        </w:rPr>
+        <w:t>Learning</w:t>
+      </w:r>
+      <w:proofErr w:type="spellEnd"/>
+      <w:r>
+        <w:rPr>
+          <w:rFonts w:ascii="Times New Roman" w:hAnsi="Times New Roman" w:cs="Times New Roman"/>
+          <w:lang w:val="es-ES"/>
+        </w:rPr>
+        <w:t xml:space="preserve"> permite desarrollar sistemas inteligentes capaces de optimizar el consumo energético mediante análisis predictivos y aprendizaje continuo. Estos modelos mejoran la precisión en la toma de decisiones relacionadas con la gestión energética industrial y contribuyen a reducir costos operativos mediante la detección temprana de ineficiencias energéticas.</w:t>
       </w:r>
     </w:p>
     <w:p>
@@ -7622,7 +7846,23 @@
           <w:rFonts w:ascii="Times New Roman" w:eastAsia="Times New Roman" w:hAnsi="Times New Roman" w:cs="Times New Roman"/>
           <w:lang w:val="es-ES"/>
         </w:rPr>
-        <w:t xml:space="preserve">Como justificación económica, la implementación de un sistema inteligente basado en Machine Learning e </w:t>
+        <w:t xml:space="preserve">Como justificación económica, la implementación de un sistema inteligente basado en Machine </w:t>
+      </w:r>
+      <w:proofErr w:type="spellStart"/>
+      <w:r>
+        <w:rPr>
+          <w:rFonts w:ascii="Times New Roman" w:eastAsia="Times New Roman" w:hAnsi="Times New Roman" w:cs="Times New Roman"/>
+          <w:lang w:val="es-ES"/>
+        </w:rPr>
+        <w:t>Learning</w:t>
+      </w:r>
+      <w:proofErr w:type="spellEnd"/>
+      <w:r>
+        <w:rPr>
+          <w:rFonts w:ascii="Times New Roman" w:eastAsia="Times New Roman" w:hAnsi="Times New Roman" w:cs="Times New Roman"/>
+          <w:lang w:val="es-ES"/>
+        </w:rPr>
+        <w:t xml:space="preserve"> e </w:t>
       </w:r>
       <w:proofErr w:type="spellStart"/>
       <w:r>
@@ -8188,7 +8428,23 @@
           <w:rFonts w:ascii="Times New Roman" w:hAnsi="Times New Roman" w:cs="Times New Roman"/>
           <w:lang w:val="es-ES"/>
         </w:rPr>
-        <w:t xml:space="preserve"> y Machine Learning. Fernández-Vigo et al. </w:t>
+        <w:t xml:space="preserve"> y Machine </w:t>
+      </w:r>
+      <w:proofErr w:type="spellStart"/>
+      <w:r>
+        <w:rPr>
+          <w:rFonts w:ascii="Times New Roman" w:hAnsi="Times New Roman" w:cs="Times New Roman"/>
+          <w:lang w:val="es-ES"/>
+        </w:rPr>
+        <w:t>Learning</w:t>
+      </w:r>
+      <w:proofErr w:type="spellEnd"/>
+      <w:r>
+        <w:rPr>
+          <w:rFonts w:ascii="Times New Roman" w:hAnsi="Times New Roman" w:cs="Times New Roman"/>
+          <w:lang w:val="es-ES"/>
+        </w:rPr>
+        <w:t xml:space="preserve">. Fernández-Vigo et al. </w:t>
       </w:r>
       <w:r>
         <w:rPr>
@@ -14112,7 +14368,23 @@
           <w:rFonts w:ascii="Times New Roman" w:hAnsi="Times New Roman" w:cs="Times New Roman"/>
           <w:lang w:val="es-ES"/>
         </w:rPr>
-        <w:t>, Machine Learning y sistemas inteligentes aplicados a entornos agroindustriales. Además, apoyará en la organización de referencias, antecedentes y sustento teórico del proyecto.</w:t>
+        <w:t xml:space="preserve">, Machine </w:t>
+      </w:r>
+      <w:proofErr w:type="spellStart"/>
+      <w:r>
+        <w:rPr>
+          <w:rFonts w:ascii="Times New Roman" w:hAnsi="Times New Roman" w:cs="Times New Roman"/>
+          <w:lang w:val="es-ES"/>
+        </w:rPr>
+        <w:t>Learning</w:t>
+      </w:r>
+      <w:proofErr w:type="spellEnd"/>
+      <w:r>
+        <w:rPr>
+          <w:rFonts w:ascii="Times New Roman" w:hAnsi="Times New Roman" w:cs="Times New Roman"/>
+          <w:lang w:val="es-ES"/>
+        </w:rPr>
+        <w:t xml:space="preserve"> y sistemas inteligentes aplicados a entornos agroindustriales. Además, apoyará en la organización de referencias, antecedentes y sustento teórico del proyecto.</w:t>
       </w:r>
     </w:p>
     <w:p>
@@ -27677,6 +27949,54 @@
           <w:lang w:val="es-ES"/>
         </w:rPr>
       </w:pPr>
+      <w:r>
+        <w:rPr>
+          <w:rFonts w:ascii="Times New Roman" w:eastAsia="Times New Roman" w:hAnsi="Times New Roman" w:cs="Times New Roman"/>
+          <w:lang w:val="es-ES"/>
+        </w:rPr>
+        <w:lastRenderedPageBreak/>
+        <w:drawing>
+          <wp:inline distT="0" distB="0" distL="0" distR="0" wp14:anchorId="49A2A218" wp14:editId="49EF5D1B">
+            <wp:extent cx="5400040" cy="2616835"/>
+            <wp:effectExtent l="0" t="0" r="0" b="0"/>
+            <wp:docPr id="1920615520" name="Imagen 1"/>
+            <wp:cNvGraphicFramePr>
+              <a:graphicFrameLocks xmlns:a="http://schemas.openxmlformats.org/drawingml/2006/main" noChangeAspect="1"/>
+            </wp:cNvGraphicFramePr>
+            <a:graphic xmlns:a="http://schemas.openxmlformats.org/drawingml/2006/main">
+              <a:graphicData uri="http://schemas.openxmlformats.org/drawingml/2006/picture">
+                <pic:pic xmlns:pic="http://schemas.openxmlformats.org/drawingml/2006/picture">
+                  <pic:nvPicPr>
+                    <pic:cNvPr id="1920615520" name=""/>
+                    <pic:cNvPicPr/>
+                  </pic:nvPicPr>
+                  <pic:blipFill>
+                    <a:blip r:embed="rId48" cstate="print">
+                      <a:extLst>
+                        <a:ext uri="{28A0092B-C50C-407E-A947-70E740481C1C}">
+                          <a14:useLocalDpi xmlns:a14="http://schemas.microsoft.com/office/drawing/2010/main" val="0"/>
+                        </a:ext>
+                      </a:extLst>
+                    </a:blip>
+                    <a:stretch>
+                      <a:fillRect/>
+                    </a:stretch>
+                  </pic:blipFill>
+                  <pic:spPr>
+                    <a:xfrm>
+                      <a:off x="0" y="0"/>
+                      <a:ext cx="5400040" cy="2616835"/>
+                    </a:xfrm>
+                    <a:prstGeom prst="rect">
+                      <a:avLst/>
+                    </a:prstGeom>
+                  </pic:spPr>
+                </pic:pic>
+              </a:graphicData>
+            </a:graphic>
+          </wp:inline>
+        </w:drawing>
+      </w:r>
     </w:p>
     <w:p>
       <w:pPr>
@@ -27709,6 +28029,15 @@
           <w:lang w:val="es-ES"/>
         </w:rPr>
       </w:pPr>
+    </w:p>
+    <w:p>
+      <w:pPr>
+        <w:jc w:val="center"/>
+        <w:rPr>
+          <w:rFonts w:ascii="Times New Roman" w:eastAsia="Times New Roman" w:hAnsi="Times New Roman" w:cs="Times New Roman"/>
+          <w:lang w:val="es-ES"/>
+        </w:rPr>
+      </w:pPr>
       <w:r>
         <w:rPr>
           <w:rFonts w:ascii="Times New Roman" w:eastAsia="Times New Roman" w:hAnsi="Times New Roman" w:cs="Times New Roman"/>
@@ -27811,36 +28140,6 @@
           <w:rFonts w:ascii="Times New Roman" w:eastAsia="Times New Roman" w:hAnsi="Times New Roman" w:cs="Times New Roman"/>
           <w:lang w:val="es-ES"/>
         </w:rPr>
-        <w:t>7</w:t>
-      </w:r>
-      <w:r>
-        <w:rPr>
-          <w:rFonts w:ascii="Times New Roman" w:eastAsia="Times New Roman" w:hAnsi="Times New Roman" w:cs="Times New Roman"/>
-          <w:lang w:val="es-ES"/>
-        </w:rPr>
-        <w:t>: Formato de consentimiento informado, si se recopila información de personas.</w:t>
-      </w:r>
-    </w:p>
-    <w:p>
-      <w:pPr>
-        <w:jc w:val="center"/>
-        <w:rPr>
-          <w:rFonts w:ascii="Times New Roman" w:eastAsia="Times New Roman" w:hAnsi="Times New Roman" w:cs="Times New Roman"/>
-          <w:lang w:val="es-ES"/>
-        </w:rPr>
-      </w:pPr>
-      <w:r>
-        <w:rPr>
-          <w:rFonts w:ascii="Times New Roman" w:eastAsia="Times New Roman" w:hAnsi="Times New Roman" w:cs="Times New Roman"/>
-          <w:lang w:val="es-ES"/>
-        </w:rPr>
-        <w:t xml:space="preserve">Anexo </w:t>
-      </w:r>
-      <w:r>
-        <w:rPr>
-          <w:rFonts w:ascii="Times New Roman" w:eastAsia="Times New Roman" w:hAnsi="Times New Roman" w:cs="Times New Roman"/>
-          <w:lang w:val="es-ES"/>
-        </w:rPr>
         <w:t>8</w:t>
       </w:r>
       <w:r>
@@ -27849,37 +28148,6 @@
           <w:lang w:val="es-ES"/>
         </w:rPr>
         <w:t>: Evidencias de prueba piloto, configuración experimental o capturas del sistema.</w:t>
-      </w:r>
-    </w:p>
-    <w:p>
-      <w:pPr>
-        <w:jc w:val="center"/>
-        <w:rPr>
-          <w:rFonts w:ascii="Times New Roman" w:eastAsia="Times New Roman" w:hAnsi="Times New Roman" w:cs="Times New Roman"/>
-          <w:lang w:val="es-ES"/>
-        </w:rPr>
-      </w:pPr>
-      <w:r>
-        <w:rPr>
-          <w:rFonts w:ascii="Times New Roman" w:eastAsia="Times New Roman" w:hAnsi="Times New Roman" w:cs="Times New Roman"/>
-          <w:lang w:val="es-ES"/>
-        </w:rPr>
-        <w:lastRenderedPageBreak/>
-        <w:t xml:space="preserve">Anexo </w:t>
-      </w:r>
-      <w:r>
-        <w:rPr>
-          <w:rFonts w:ascii="Times New Roman" w:eastAsia="Times New Roman" w:hAnsi="Times New Roman" w:cs="Times New Roman"/>
-          <w:lang w:val="es-ES"/>
-        </w:rPr>
-        <w:t>9</w:t>
-      </w:r>
-      <w:r>
-        <w:rPr>
-          <w:rFonts w:ascii="Times New Roman" w:eastAsia="Times New Roman" w:hAnsi="Times New Roman" w:cs="Times New Roman"/>
-          <w:lang w:val="es-ES"/>
-        </w:rPr>
-        <w:t>: Otros documentos técnicos pertinentes para la investigación.</w:t>
       </w:r>
     </w:p>
     <w:p>
@@ -30303,6 +30571,7 @@
   <w:style w:type="character" w:default="1" w:styleId="Fuentedeprrafopredeter">
     <w:name w:val="Default Paragraph Font"/>
     <w:uiPriority w:val="1"/>
+    <w:semiHidden/>
     <w:unhideWhenUsed/>
   </w:style>
   <w:style w:type="table" w:default="1" w:styleId="Tablanormal">

</xml_diff>